<commit_message>
añado filtrado por categoría en carta
</commit_message>
<xml_diff>
--- a/memoria/ÁlvaroM - Restaurante.docx
+++ b/memoria/ÁlvaroM - Restaurante.docx
@@ -723,6 +723,12 @@
     </w:p>
     <w:sdt>
       <w:sdtPr>
+        <w:rPr>
+          <w:rFonts w:cstheme="minorBidi"/>
+          <w:noProof w:val="0"/>
+          <w:sz w:val="22"/>
+          <w:szCs w:val="22"/>
+        </w:rPr>
         <w:id w:val="-1224295511"/>
         <w:docPartObj>
           <w:docPartGallery w:val="Table of Contents"/>
@@ -731,12 +737,8 @@
       </w:sdtPr>
       <w:sdtEndPr>
         <w:rPr>
-          <w:rFonts w:cstheme="minorBidi"/>
           <w:b/>
           <w:bCs/>
-          <w:noProof w:val="0"/>
-          <w:sz w:val="22"/>
-          <w:szCs w:val="22"/>
         </w:rPr>
       </w:sdtEndPr>
       <w:sdtContent>
@@ -1507,21 +1509,7 @@
                 <w:rStyle w:val="Hipervnculo"/>
                 <w:noProof/>
               </w:rPr>
-              <w:t>Interf</w:t>
-            </w:r>
-            <w:r>
-              <w:rPr>
-                <w:rStyle w:val="Hipervnculo"/>
-                <w:noProof/>
-              </w:rPr>
-              <w:t>a</w:t>
-            </w:r>
-            <w:r>
-              <w:rPr>
-                <w:rStyle w:val="Hipervnculo"/>
-                <w:noProof/>
-              </w:rPr>
-              <w:t>z para los clientes e implementaci</w:t>
+              <w:t>Interfaz para los clientes e implementaci</w:t>
             </w:r>
             <w:r>
               <w:rPr>
@@ -1701,47 +1689,24 @@
         </w:rPr>
         <w:br w:type="page"/>
       </w:r>
-      <w:bookmarkStart w:id="2" w:name="_Toc179231847"/>
-      <w:bookmarkStart w:id="3" w:name="_Toc213599762"/>
+      <w:bookmarkStart w:id="2" w:name="_Toc213599762"/>
+      <w:bookmarkStart w:id="3" w:name="_Toc179231847"/>
       <w:r>
         <w:rPr>
           <w:b/>
           <w:bCs/>
         </w:rPr>
         <w:lastRenderedPageBreak/>
-        <w:t xml:space="preserve">Sprint </w:t>
-      </w:r>
-      <w:proofErr w:type="gramStart"/>
+        <w:t>Sprint 1</w:t>
+      </w:r>
       <w:r>
         <w:rPr>
           <w:b/>
           <w:bCs/>
         </w:rPr>
-        <w:t>1</w:t>
-      </w:r>
-      <w:r>
-        <w:rPr>
-          <w:b/>
-          <w:bCs/>
-        </w:rPr>
-        <w:t xml:space="preserve">  -</w:t>
-      </w:r>
-      <w:proofErr w:type="gramEnd"/>
-      <w:r>
-        <w:rPr>
-          <w:b/>
-          <w:bCs/>
-        </w:rPr>
-        <w:t xml:space="preserve"> </w:t>
-      </w:r>
-      <w:r>
-        <w:rPr>
-          <w:b/>
-          <w:bCs/>
-        </w:rPr>
-        <w:t>Fundamentos del Sistema y Roles</w:t>
-      </w:r>
-      <w:bookmarkEnd w:id="3"/>
+        <w:t xml:space="preserve">  - Fundamentos del Sistema y Roles</w:t>
+      </w:r>
+      <w:bookmarkEnd w:id="2"/>
     </w:p>
     <w:p>
       <w:pPr>
@@ -1828,6 +1793,7 @@
       <w:r>
         <w:rPr>
           <w:rFonts w:cstheme="minorHAnsi"/>
+          <w:noProof/>
           <w:sz w:val="24"/>
           <w:szCs w:val="24"/>
         </w:rPr>
@@ -1918,6 +1884,7 @@
       <w:r>
         <w:rPr>
           <w:rStyle w:val="Ttulo3Car"/>
+          <w:noProof/>
         </w:rPr>
         <w:drawing>
           <wp:anchor distT="0" distB="0" distL="114300" distR="114300" simplePos="0" relativeHeight="251662336" behindDoc="0" locked="0" layoutInCell="1" allowOverlap="1" wp14:anchorId="29FEECA2" wp14:editId="2935D2F9">
@@ -2031,6 +1998,9 @@
         <w:jc w:val="both"/>
       </w:pPr>
       <w:r>
+        <w:rPr>
+          <w:noProof/>
+        </w:rPr>
         <w:drawing>
           <wp:anchor distT="0" distB="0" distL="114300" distR="114300" simplePos="0" relativeHeight="251663360" behindDoc="0" locked="0" layoutInCell="1" allowOverlap="1" wp14:anchorId="6C6720B1" wp14:editId="776B8C9B">
             <wp:simplePos x="0" y="0"/>
@@ -2088,31 +2058,7 @@
         </w:drawing>
       </w:r>
       <w:r>
-        <w:t>Desde </w:t>
-      </w:r>
-      <w:proofErr w:type="spellStart"/>
-      <w:r>
-        <w:t>index.php</w:t>
-      </w:r>
-      <w:proofErr w:type="spellEnd"/>
-      <w:r>
-        <w:t> se puede iniciar sesión, y desde </w:t>
-      </w:r>
-      <w:proofErr w:type="spellStart"/>
-      <w:r>
-        <w:t>registro.php</w:t>
-      </w:r>
-      <w:proofErr w:type="spellEnd"/>
-      <w:r>
-        <w:t xml:space="preserve"> se pueden registrar nuevos clientes. Una vez </w:t>
-      </w:r>
-      <w:proofErr w:type="spellStart"/>
-      <w:r>
-        <w:t>logueado</w:t>
-      </w:r>
-      <w:proofErr w:type="spellEnd"/>
-      <w:r>
-        <w:t>, el sistema redirige al usuario según su rol.</w:t>
+        <w:t>Desde index.php se puede iniciar sesión, y desde registro.php se pueden registrar nuevos clientes. Una vez logueado, el sistema redirige al usuario según su rol.</w:t>
       </w:r>
     </w:p>
     <w:p>
@@ -2275,6 +2221,9 @@
         <w:jc w:val="both"/>
       </w:pPr>
       <w:r>
+        <w:rPr>
+          <w:noProof/>
+        </w:rPr>
         <w:drawing>
           <wp:anchor distT="0" distB="0" distL="114300" distR="114300" simplePos="0" relativeHeight="251666432" behindDoc="0" locked="0" layoutInCell="1" allowOverlap="1" wp14:anchorId="2767266D" wp14:editId="6ECCFF36">
             <wp:simplePos x="0" y="0"/>
@@ -2404,6 +2353,9 @@
         <w:jc w:val="both"/>
       </w:pPr>
       <w:r>
+        <w:rPr>
+          <w:noProof/>
+        </w:rPr>
         <w:drawing>
           <wp:anchor distT="0" distB="0" distL="114300" distR="114300" simplePos="0" relativeHeight="251668480" behindDoc="0" locked="0" layoutInCell="1" allowOverlap="1" wp14:anchorId="42318559" wp14:editId="0E47692C">
             <wp:simplePos x="0" y="0"/>
@@ -2461,6 +2413,9 @@
         </w:drawing>
       </w:r>
       <w:r>
+        <w:rPr>
+          <w:noProof/>
+        </w:rPr>
         <w:drawing>
           <wp:anchor distT="0" distB="0" distL="114300" distR="114300" simplePos="0" relativeHeight="251667456" behindDoc="0" locked="0" layoutInCell="1" allowOverlap="1" wp14:anchorId="58E204B3" wp14:editId="48780EA7">
             <wp:simplePos x="0" y="0"/>
@@ -2518,6 +2473,9 @@
         </w:drawing>
       </w:r>
       <w:r>
+        <w:rPr>
+          <w:noProof/>
+        </w:rPr>
         <w:drawing>
           <wp:anchor distT="0" distB="0" distL="114300" distR="114300" simplePos="0" relativeHeight="251665408" behindDoc="0" locked="0" layoutInCell="1" allowOverlap="1" wp14:anchorId="0B86EE1B" wp14:editId="5312F789">
             <wp:simplePos x="0" y="0"/>
@@ -2598,15 +2556,7 @@
           <w:bCs/>
         </w:rPr>
         <w:lastRenderedPageBreak/>
-        <w:t xml:space="preserve">Sprint </w:t>
-      </w:r>
-      <w:proofErr w:type="gramStart"/>
-      <w:r>
-        <w:rPr>
-          <w:b/>
-          <w:bCs/>
-        </w:rPr>
-        <w:t>2</w:t>
+        <w:t>Sprint 2</w:t>
       </w:r>
       <w:r>
         <w:rPr>
@@ -2620,22 +2570,7 @@
           <w:b/>
           <w:bCs/>
         </w:rPr>
-        <w:t xml:space="preserve"> -</w:t>
-      </w:r>
-      <w:proofErr w:type="gramEnd"/>
-      <w:r>
-        <w:rPr>
-          <w:b/>
-          <w:bCs/>
-        </w:rPr>
-        <w:t xml:space="preserve"> </w:t>
-      </w:r>
-      <w:r>
-        <w:rPr>
-          <w:b/>
-          <w:bCs/>
-        </w:rPr>
-        <w:t>Gestión de Mesas y toma de pedidos.</w:t>
+        <w:t xml:space="preserve"> - Gestión de Mesas y toma de pedidos.</w:t>
       </w:r>
       <w:bookmarkEnd w:id="10"/>
     </w:p>
@@ -2663,6 +2598,9 @@
         <w:jc w:val="both"/>
       </w:pPr>
       <w:r>
+        <w:rPr>
+          <w:noProof/>
+        </w:rPr>
         <w:drawing>
           <wp:anchor distT="0" distB="0" distL="114300" distR="114300" simplePos="0" relativeHeight="251671552" behindDoc="0" locked="0" layoutInCell="1" allowOverlap="1" wp14:anchorId="1A1C1AE0" wp14:editId="298E54E6">
             <wp:simplePos x="0" y="0"/>
@@ -2730,7 +2668,6 @@
       <w:r>
         <w:t xml:space="preserve">En </w:t>
       </w:r>
-      <w:proofErr w:type="spellStart"/>
       <w:r>
         <w:rPr>
           <w:b/>
@@ -2738,7 +2675,6 @@
         </w:rPr>
         <w:t>mesa.php</w:t>
       </w:r>
-      <w:proofErr w:type="spellEnd"/>
       <w:r>
         <w:t>:</w:t>
       </w:r>
@@ -2755,7 +2691,6 @@
       <w:r>
         <w:t xml:space="preserve">Consulta a la base de datos las mesas que existen y se pintan sobre el diseño en un sistema </w:t>
       </w:r>
-      <w:proofErr w:type="spellStart"/>
       <w:r>
         <w:rPr>
           <w:i/>
@@ -2763,7 +2698,6 @@
         </w:rPr>
         <w:t>grid</w:t>
       </w:r>
-      <w:proofErr w:type="spellEnd"/>
       <w:r>
         <w:t xml:space="preserve"> </w:t>
       </w:r>
@@ -2783,7 +2717,6 @@
       <w:r>
         <w:t xml:space="preserve">Se puede seleccionar una mesa, esto redirige a </w:t>
       </w:r>
-      <w:proofErr w:type="spellStart"/>
       <w:r>
         <w:rPr>
           <w:b/>
@@ -2791,7 +2724,6 @@
         </w:rPr>
         <w:t>eligeComensales.php</w:t>
       </w:r>
-      <w:proofErr w:type="spellEnd"/>
       <w:r>
         <w:t>.</w:t>
       </w:r>
@@ -2813,17 +2745,8 @@
           <w:b/>
           <w:bCs/>
         </w:rPr>
-        <w:t xml:space="preserve">automáticamente se realiza un </w:t>
-      </w:r>
-      <w:proofErr w:type="spellStart"/>
-      <w:r>
-        <w:rPr>
-          <w:b/>
-          <w:bCs/>
-        </w:rPr>
-        <w:t>insert</w:t>
-      </w:r>
-      <w:proofErr w:type="spellEnd"/>
+        <w:t>automáticamente se realiza un insert</w:t>
+      </w:r>
       <w:r>
         <w:t xml:space="preserve"> en la base de datos </w:t>
       </w:r>
@@ -2855,7 +2778,6 @@
       <w:r>
         <w:t xml:space="preserve">En </w:t>
       </w:r>
-      <w:proofErr w:type="spellStart"/>
       <w:r>
         <w:rPr>
           <w:b/>
@@ -2863,7 +2785,6 @@
         </w:rPr>
         <w:t>eligeComensales.php</w:t>
       </w:r>
-      <w:proofErr w:type="spellEnd"/>
       <w:r>
         <w:t>:</w:t>
       </w:r>
@@ -2878,23 +2799,7 @@
         <w:jc w:val="both"/>
       </w:pPr>
       <w:r>
-        <w:t xml:space="preserve">Al poner un número de comensales, como mínimo 1 y máximo 15, se realiza un </w:t>
-      </w:r>
-      <w:proofErr w:type="spellStart"/>
-      <w:r>
-        <w:t>update</w:t>
-      </w:r>
-      <w:proofErr w:type="spellEnd"/>
-      <w:r>
-        <w:t xml:space="preserve"> en el </w:t>
-      </w:r>
-      <w:proofErr w:type="spellStart"/>
-      <w:r>
-        <w:t>insert</w:t>
-      </w:r>
-      <w:proofErr w:type="spellEnd"/>
-      <w:r>
-        <w:t xml:space="preserve"> anteriormente mencionado sobre los comensales. </w:t>
+        <w:t xml:space="preserve">Al poner un número de comensales, como mínimo 1 y máximo 15, se realiza un update en el insert anteriormente mencionado sobre los comensales. </w:t>
       </w:r>
     </w:p>
     <w:p>
@@ -2909,7 +2814,6 @@
       <w:r>
         <w:t xml:space="preserve">Teniendo todos los campos cubiertos, podremos entrar a </w:t>
       </w:r>
-      <w:proofErr w:type="spellStart"/>
       <w:r>
         <w:rPr>
           <w:b/>
@@ -2917,7 +2821,6 @@
         </w:rPr>
         <w:t>carta.php</w:t>
       </w:r>
-      <w:proofErr w:type="spellEnd"/>
     </w:p>
     <w:p>
       <w:pPr>
@@ -2926,7 +2829,6 @@
       <w:r>
         <w:t xml:space="preserve">En </w:t>
       </w:r>
-      <w:proofErr w:type="spellStart"/>
       <w:r>
         <w:rPr>
           <w:b/>
@@ -2934,7 +2836,6 @@
         </w:rPr>
         <w:t>carta.php</w:t>
       </w:r>
-      <w:proofErr w:type="spellEnd"/>
       <w:r>
         <w:t>:</w:t>
       </w:r>
@@ -2951,7 +2852,6 @@
       <w:r>
         <w:t xml:space="preserve">Tenemos 2 </w:t>
       </w:r>
-      <w:proofErr w:type="spellStart"/>
       <w:r>
         <w:rPr>
           <w:i/>
@@ -2959,7 +2859,6 @@
         </w:rPr>
         <w:t>cards</w:t>
       </w:r>
-      <w:proofErr w:type="spellEnd"/>
       <w:r>
         <w:t>, en 1 tenemos la carta, y en otra el pedido actual.</w:t>
       </w:r>
@@ -2993,6 +2892,9 @@
       <w:r>
         <w:t xml:space="preserve"> por el encargado.</w:t>
       </w:r>
+      <w:r>
+        <w:t xml:space="preserve"> También se puede filtrar por categorías.</w:t>
+      </w:r>
     </w:p>
     <w:p>
       <w:pPr>
@@ -3027,17 +2929,9 @@
         <w:jc w:val="both"/>
       </w:pPr>
       <w:r>
-        <w:t xml:space="preserve">Al enviar el pedido, hacemos un </w:t>
-      </w:r>
-      <w:proofErr w:type="spellStart"/>
-      <w:r>
-        <w:t>insert</w:t>
-      </w:r>
-      <w:proofErr w:type="spellEnd"/>
-      <w:r>
-        <w:t xml:space="preserve"> en la tabla pedidos ocupando el pedido completo del cliente.</w:t>
-      </w:r>
-      <w:bookmarkEnd w:id="2"/>
+        <w:t>Al enviar el pedido, hacemos un insert en la tabla pedidos ocupando el pedido completo del cliente.</w:t>
+      </w:r>
+      <w:bookmarkEnd w:id="3"/>
     </w:p>
     <w:p>
       <w:pPr>
@@ -5884,6 +5778,7 @@
   <w:style w:type="character" w:default="1" w:styleId="Fuentedeprrafopredeter">
     <w:name w:val="Default Paragraph Font"/>
     <w:uiPriority w:val="1"/>
+    <w:semiHidden/>
     <w:unhideWhenUsed/>
   </w:style>
   <w:style w:type="table" w:default="1" w:styleId="Tablanormal">

</xml_diff>

<commit_message>
cliente ahora puede sacar pdfs como facturas
</commit_message>
<xml_diff>
--- a/memoria/ÁlvaroM - Restaurante.docx
+++ b/memoria/ÁlvaroM - Restaurante.docx
@@ -3634,7 +3634,7 @@
           <w:noProof/>
         </w:rPr>
         <w:drawing>
-          <wp:anchor distT="0" distB="0" distL="114300" distR="114300" simplePos="0" relativeHeight="251678720" behindDoc="0" locked="0" layoutInCell="1" allowOverlap="1" wp14:anchorId="61C4CDEA" wp14:editId="13CF8D0B">
+          <wp:anchor distT="0" distB="0" distL="114300" distR="114300" simplePos="0" relativeHeight="251678720" behindDoc="0" locked="0" layoutInCell="1" allowOverlap="1" wp14:anchorId="61C4CDEA" wp14:editId="3F09EF7A">
             <wp:simplePos x="0" y="0"/>
             <wp:positionH relativeFrom="column">
               <wp:posOffset>3704590</wp:posOffset>
@@ -4293,6 +4293,9 @@
     </w:p>
     <w:p>
       <w:r>
+        <w:rPr>
+          <w:noProof/>
+        </w:rPr>
         <w:lastRenderedPageBreak/>
         <w:drawing>
           <wp:anchor distT="0" distB="0" distL="114300" distR="114300" simplePos="0" relativeHeight="251683840" behindDoc="0" locked="0" layoutInCell="1" allowOverlap="1" wp14:anchorId="79081F0A" wp14:editId="6A4649D3">
@@ -4613,9 +4616,168 @@
       </w:r>
       <w:bookmarkEnd w:id="17"/>
     </w:p>
+    <w:p>
+      <w:r>
+        <w:rPr>
+          <w:noProof/>
+        </w:rPr>
+        <w:drawing>
+          <wp:anchor distT="0" distB="0" distL="114300" distR="114300" simplePos="0" relativeHeight="251684864" behindDoc="0" locked="0" layoutInCell="1" allowOverlap="1" wp14:anchorId="430913C6" wp14:editId="17C8A146">
+            <wp:simplePos x="0" y="0"/>
+            <wp:positionH relativeFrom="margin">
+              <wp:align>right</wp:align>
+            </wp:positionH>
+            <wp:positionV relativeFrom="paragraph">
+              <wp:posOffset>384810</wp:posOffset>
+            </wp:positionV>
+            <wp:extent cx="5400040" cy="1967865"/>
+            <wp:effectExtent l="0" t="0" r="0" b="0"/>
+            <wp:wrapTopAndBottom/>
+            <wp:docPr id="508967157" name="Imagen 1"/>
+            <wp:cNvGraphicFramePr>
+              <a:graphicFrameLocks xmlns:a="http://schemas.openxmlformats.org/drawingml/2006/main" noChangeAspect="1"/>
+            </wp:cNvGraphicFramePr>
+            <a:graphic xmlns:a="http://schemas.openxmlformats.org/drawingml/2006/main">
+              <a:graphicData uri="http://schemas.openxmlformats.org/drawingml/2006/picture">
+                <pic:pic xmlns:pic="http://schemas.openxmlformats.org/drawingml/2006/picture">
+                  <pic:nvPicPr>
+                    <pic:cNvPr id="508967157" name=""/>
+                    <pic:cNvPicPr/>
+                  </pic:nvPicPr>
+                  <pic:blipFill>
+                    <a:blip r:embed="rId32">
+                      <a:extLst>
+                        <a:ext uri="{28A0092B-C50C-407E-A947-70E740481C1C}">
+                          <a14:useLocalDpi xmlns:a14="http://schemas.microsoft.com/office/drawing/2010/main" val="0"/>
+                        </a:ext>
+                      </a:extLst>
+                    </a:blip>
+                    <a:stretch>
+                      <a:fillRect/>
+                    </a:stretch>
+                  </pic:blipFill>
+                  <pic:spPr>
+                    <a:xfrm>
+                      <a:off x="0" y="0"/>
+                      <a:ext cx="5400040" cy="1967865"/>
+                    </a:xfrm>
+                    <a:prstGeom prst="rect">
+                      <a:avLst/>
+                    </a:prstGeom>
+                  </pic:spPr>
+                </pic:pic>
+              </a:graphicData>
+            </a:graphic>
+          </wp:anchor>
+        </w:drawing>
+      </w:r>
+    </w:p>
+    <w:p>
+      <w:r>
+        <w:rPr>
+          <w:noProof/>
+        </w:rPr>
+        <w:drawing>
+          <wp:anchor distT="0" distB="0" distL="114300" distR="114300" simplePos="0" relativeHeight="251685888" behindDoc="0" locked="0" layoutInCell="1" allowOverlap="1" wp14:anchorId="77014AA0" wp14:editId="19240265">
+            <wp:simplePos x="0" y="0"/>
+            <wp:positionH relativeFrom="margin">
+              <wp:align>center</wp:align>
+            </wp:positionH>
+            <wp:positionV relativeFrom="paragraph">
+              <wp:posOffset>2423795</wp:posOffset>
+            </wp:positionV>
+            <wp:extent cx="5001260" cy="3347720"/>
+            <wp:effectExtent l="0" t="0" r="8890" b="5080"/>
+            <wp:wrapTopAndBottom/>
+            <wp:docPr id="434054803" name="Imagen 1"/>
+            <wp:cNvGraphicFramePr>
+              <a:graphicFrameLocks xmlns:a="http://schemas.openxmlformats.org/drawingml/2006/main" noChangeAspect="1"/>
+            </wp:cNvGraphicFramePr>
+            <a:graphic xmlns:a="http://schemas.openxmlformats.org/drawingml/2006/main">
+              <a:graphicData uri="http://schemas.openxmlformats.org/drawingml/2006/picture">
+                <pic:pic xmlns:pic="http://schemas.openxmlformats.org/drawingml/2006/picture">
+                  <pic:nvPicPr>
+                    <pic:cNvPr id="434054803" name=""/>
+                    <pic:cNvPicPr/>
+                  </pic:nvPicPr>
+                  <pic:blipFill>
+                    <a:blip r:embed="rId33">
+                      <a:extLst>
+                        <a:ext uri="{28A0092B-C50C-407E-A947-70E740481C1C}">
+                          <a14:useLocalDpi xmlns:a14="http://schemas.microsoft.com/office/drawing/2010/main" val="0"/>
+                        </a:ext>
+                      </a:extLst>
+                    </a:blip>
+                    <a:stretch>
+                      <a:fillRect/>
+                    </a:stretch>
+                  </pic:blipFill>
+                  <pic:spPr>
+                    <a:xfrm>
+                      <a:off x="0" y="0"/>
+                      <a:ext cx="5001260" cy="3347720"/>
+                    </a:xfrm>
+                    <a:prstGeom prst="rect">
+                      <a:avLst/>
+                    </a:prstGeom>
+                  </pic:spPr>
+                </pic:pic>
+              </a:graphicData>
+            </a:graphic>
+            <wp14:sizeRelH relativeFrom="margin">
+              <wp14:pctWidth>0</wp14:pctWidth>
+            </wp14:sizeRelH>
+            <wp14:sizeRelV relativeFrom="margin">
+              <wp14:pctHeight>0</wp14:pctHeight>
+            </wp14:sizeRelV>
+          </wp:anchor>
+        </w:drawing>
+      </w:r>
+    </w:p>
+    <w:p/>
+    <w:p>
+      <w:r>
+        <w:lastRenderedPageBreak/>
+        <w:drawing>
+          <wp:inline distT="0" distB="0" distL="0" distR="0" wp14:anchorId="22626642" wp14:editId="665AA8C8">
+            <wp:extent cx="5400040" cy="3084830"/>
+            <wp:effectExtent l="0" t="0" r="0" b="1270"/>
+            <wp:docPr id="892006852" name="Imagen 1"/>
+            <wp:cNvGraphicFramePr>
+              <a:graphicFrameLocks xmlns:a="http://schemas.openxmlformats.org/drawingml/2006/main" noChangeAspect="1"/>
+            </wp:cNvGraphicFramePr>
+            <a:graphic xmlns:a="http://schemas.openxmlformats.org/drawingml/2006/main">
+              <a:graphicData uri="http://schemas.openxmlformats.org/drawingml/2006/picture">
+                <pic:pic xmlns:pic="http://schemas.openxmlformats.org/drawingml/2006/picture">
+                  <pic:nvPicPr>
+                    <pic:cNvPr id="892006852" name=""/>
+                    <pic:cNvPicPr/>
+                  </pic:nvPicPr>
+                  <pic:blipFill>
+                    <a:blip r:embed="rId34"/>
+                    <a:stretch>
+                      <a:fillRect/>
+                    </a:stretch>
+                  </pic:blipFill>
+                  <pic:spPr>
+                    <a:xfrm>
+                      <a:off x="0" y="0"/>
+                      <a:ext cx="5400040" cy="3084830"/>
+                    </a:xfrm>
+                    <a:prstGeom prst="rect">
+                      <a:avLst/>
+                    </a:prstGeom>
+                  </pic:spPr>
+                </pic:pic>
+              </a:graphicData>
+            </a:graphic>
+          </wp:inline>
+        </w:drawing>
+      </w:r>
+    </w:p>
     <w:sectPr>
-      <w:headerReference w:type="default" r:id="rId32"/>
-      <w:footerReference w:type="default" r:id="rId33"/>
+      <w:headerReference w:type="default" r:id="rId35"/>
+      <w:footerReference w:type="default" r:id="rId36"/>
       <w:pgSz w:w="11906" w:h="16838"/>
       <w:pgMar w:top="1417" w:right="1701" w:bottom="1417" w:left="1701" w:header="708" w:footer="643" w:gutter="0"/>
       <w:pgNumType w:start="0"/>

</xml_diff>

<commit_message>
añado pruebas realizadas para sacar tickets en cocina
</commit_message>
<xml_diff>
--- a/memoria/ÁlvaroM - Restaurante.docx
+++ b/memoria/ÁlvaroM - Restaurante.docx
@@ -3634,7 +3634,7 @@
           <w:noProof/>
         </w:rPr>
         <w:drawing>
-          <wp:anchor distT="0" distB="0" distL="114300" distR="114300" simplePos="0" relativeHeight="251678720" behindDoc="0" locked="0" layoutInCell="1" allowOverlap="1" wp14:anchorId="61C4CDEA" wp14:editId="3F09EF7A">
+          <wp:anchor distT="0" distB="0" distL="114300" distR="114300" simplePos="0" relativeHeight="251678720" behindDoc="0" locked="0" layoutInCell="1" allowOverlap="1" wp14:anchorId="61C4CDEA" wp14:editId="090D1D85">
             <wp:simplePos x="0" y="0"/>
             <wp:positionH relativeFrom="column">
               <wp:posOffset>3704590</wp:posOffset>
@@ -4617,74 +4617,72 @@
       <w:bookmarkEnd w:id="17"/>
     </w:p>
     <w:p>
+      <w:pPr>
+        <w:pStyle w:val="Ttulo3"/>
+      </w:pPr>
+    </w:p>
+    <w:p>
+      <w:pPr>
+        <w:pStyle w:val="Ttulo3"/>
+      </w:pPr>
+      <w:r>
+        <w:t>Generación automática de cuentas en formato PDF.</w:t>
+      </w:r>
+    </w:p>
+    <w:p>
+      <w:r>
+        <w:t xml:space="preserve">Para ello, he instalado la última versión con </w:t>
+      </w:r>
+      <w:proofErr w:type="spellStart"/>
+      <w:r>
+        <w:rPr>
+          <w:i/>
+          <w:iCs/>
+        </w:rPr>
+        <w:t>Composer</w:t>
+      </w:r>
+      <w:proofErr w:type="spellEnd"/>
+      <w:r>
+        <w:rPr>
+          <w:i/>
+          <w:iCs/>
+        </w:rPr>
+        <w:t xml:space="preserve"> </w:t>
+      </w:r>
+      <w:r>
+        <w:t xml:space="preserve">de </w:t>
+      </w:r>
+      <w:proofErr w:type="spellStart"/>
+      <w:r>
+        <w:rPr>
+          <w:i/>
+          <w:iCs/>
+        </w:rPr>
+        <w:t>mPDF</w:t>
+      </w:r>
+      <w:proofErr w:type="spellEnd"/>
+      <w:r>
+        <w:rPr>
+          <w:i/>
+          <w:iCs/>
+        </w:rPr>
+        <w:t xml:space="preserve"> </w:t>
+      </w:r>
+    </w:p>
+    <w:p/>
+    <w:p>
       <w:r>
         <w:rPr>
           <w:noProof/>
         </w:rPr>
         <w:drawing>
-          <wp:anchor distT="0" distB="0" distL="114300" distR="114300" simplePos="0" relativeHeight="251684864" behindDoc="0" locked="0" layoutInCell="1" allowOverlap="1" wp14:anchorId="430913C6" wp14:editId="17C8A146">
+          <wp:anchor distT="0" distB="0" distL="114300" distR="114300" simplePos="0" relativeHeight="251685888" behindDoc="0" locked="0" layoutInCell="1" allowOverlap="1" wp14:anchorId="77014AA0" wp14:editId="34028E6B">
             <wp:simplePos x="0" y="0"/>
             <wp:positionH relativeFrom="margin">
-              <wp:align>right</wp:align>
+              <wp:posOffset>52070</wp:posOffset>
             </wp:positionH>
             <wp:positionV relativeFrom="paragraph">
-              <wp:posOffset>384810</wp:posOffset>
-            </wp:positionV>
-            <wp:extent cx="5400040" cy="1967865"/>
-            <wp:effectExtent l="0" t="0" r="0" b="0"/>
-            <wp:wrapTopAndBottom/>
-            <wp:docPr id="508967157" name="Imagen 1"/>
-            <wp:cNvGraphicFramePr>
-              <a:graphicFrameLocks xmlns:a="http://schemas.openxmlformats.org/drawingml/2006/main" noChangeAspect="1"/>
-            </wp:cNvGraphicFramePr>
-            <a:graphic xmlns:a="http://schemas.openxmlformats.org/drawingml/2006/main">
-              <a:graphicData uri="http://schemas.openxmlformats.org/drawingml/2006/picture">
-                <pic:pic xmlns:pic="http://schemas.openxmlformats.org/drawingml/2006/picture">
-                  <pic:nvPicPr>
-                    <pic:cNvPr id="508967157" name=""/>
-                    <pic:cNvPicPr/>
-                  </pic:nvPicPr>
-                  <pic:blipFill>
-                    <a:blip r:embed="rId32">
-                      <a:extLst>
-                        <a:ext uri="{28A0092B-C50C-407E-A947-70E740481C1C}">
-                          <a14:useLocalDpi xmlns:a14="http://schemas.microsoft.com/office/drawing/2010/main" val="0"/>
-                        </a:ext>
-                      </a:extLst>
-                    </a:blip>
-                    <a:stretch>
-                      <a:fillRect/>
-                    </a:stretch>
-                  </pic:blipFill>
-                  <pic:spPr>
-                    <a:xfrm>
-                      <a:off x="0" y="0"/>
-                      <a:ext cx="5400040" cy="1967865"/>
-                    </a:xfrm>
-                    <a:prstGeom prst="rect">
-                      <a:avLst/>
-                    </a:prstGeom>
-                  </pic:spPr>
-                </pic:pic>
-              </a:graphicData>
-            </a:graphic>
-          </wp:anchor>
-        </w:drawing>
-      </w:r>
-    </w:p>
-    <w:p>
-      <w:r>
-        <w:rPr>
-          <w:noProof/>
-        </w:rPr>
-        <w:drawing>
-          <wp:anchor distT="0" distB="0" distL="114300" distR="114300" simplePos="0" relativeHeight="251685888" behindDoc="0" locked="0" layoutInCell="1" allowOverlap="1" wp14:anchorId="77014AA0" wp14:editId="19240265">
-            <wp:simplePos x="0" y="0"/>
-            <wp:positionH relativeFrom="margin">
-              <wp:align>center</wp:align>
-            </wp:positionH>
-            <wp:positionV relativeFrom="paragraph">
-              <wp:posOffset>2423795</wp:posOffset>
+              <wp:posOffset>3576320</wp:posOffset>
             </wp:positionV>
             <wp:extent cx="5001260" cy="3347720"/>
             <wp:effectExtent l="0" t="0" r="8890" b="5080"/>
@@ -4701,7 +4699,7 @@
                     <pic:cNvPicPr/>
                   </pic:nvPicPr>
                   <pic:blipFill>
-                    <a:blip r:embed="rId33">
+                    <a:blip r:embed="rId32">
                       <a:extLst>
                         <a:ext uri="{28A0092B-C50C-407E-A947-70E740481C1C}">
                           <a14:useLocalDpi xmlns:a14="http://schemas.microsoft.com/office/drawing/2010/main" val="0"/>
@@ -4733,10 +4731,66 @@
           </wp:anchor>
         </w:drawing>
       </w:r>
-    </w:p>
-    <w:p/>
-    <w:p>
-      <w:r>
+      <w:r>
+        <w:rPr>
+          <w:noProof/>
+        </w:rPr>
+        <w:drawing>
+          <wp:anchor distT="0" distB="0" distL="114300" distR="114300" simplePos="0" relativeHeight="251684864" behindDoc="0" locked="0" layoutInCell="1" allowOverlap="1" wp14:anchorId="430913C6" wp14:editId="24C29CE7">
+            <wp:simplePos x="0" y="0"/>
+            <wp:positionH relativeFrom="margin">
+              <wp:posOffset>-19050</wp:posOffset>
+            </wp:positionH>
+            <wp:positionV relativeFrom="paragraph">
+              <wp:posOffset>1082675</wp:posOffset>
+            </wp:positionV>
+            <wp:extent cx="5400040" cy="1967865"/>
+            <wp:effectExtent l="0" t="0" r="0" b="0"/>
+            <wp:wrapTopAndBottom/>
+            <wp:docPr id="508967157" name="Imagen 1"/>
+            <wp:cNvGraphicFramePr>
+              <a:graphicFrameLocks xmlns:a="http://schemas.openxmlformats.org/drawingml/2006/main" noChangeAspect="1"/>
+            </wp:cNvGraphicFramePr>
+            <a:graphic xmlns:a="http://schemas.openxmlformats.org/drawingml/2006/main">
+              <a:graphicData uri="http://schemas.openxmlformats.org/drawingml/2006/picture">
+                <pic:pic xmlns:pic="http://schemas.openxmlformats.org/drawingml/2006/picture">
+                  <pic:nvPicPr>
+                    <pic:cNvPr id="508967157" name=""/>
+                    <pic:cNvPicPr/>
+                  </pic:nvPicPr>
+                  <pic:blipFill>
+                    <a:blip r:embed="rId33">
+                      <a:extLst>
+                        <a:ext uri="{28A0092B-C50C-407E-A947-70E740481C1C}">
+                          <a14:useLocalDpi xmlns:a14="http://schemas.microsoft.com/office/drawing/2010/main" val="0"/>
+                        </a:ext>
+                      </a:extLst>
+                    </a:blip>
+                    <a:stretch>
+                      <a:fillRect/>
+                    </a:stretch>
+                  </pic:blipFill>
+                  <pic:spPr>
+                    <a:xfrm>
+                      <a:off x="0" y="0"/>
+                      <a:ext cx="5400040" cy="1967865"/>
+                    </a:xfrm>
+                    <a:prstGeom prst="rect">
+                      <a:avLst/>
+                    </a:prstGeom>
+                  </pic:spPr>
+                </pic:pic>
+              </a:graphicData>
+            </a:graphic>
+          </wp:anchor>
+        </w:drawing>
+      </w:r>
+    </w:p>
+    <w:p>
+      <w:r>
+        <w:rPr>
+          <w:noProof/>
+        </w:rPr>
         <w:lastRenderedPageBreak/>
         <w:drawing>
           <wp:inline distT="0" distB="0" distL="0" distR="0" wp14:anchorId="22626642" wp14:editId="665AA8C8">

</xml_diff>

<commit_message>
añado contenido a la memoria, mejorando el sprint 2
</commit_message>
<xml_diff>
--- a/memoria/ÁlvaroM - Restaurante.docx
+++ b/memoria/ÁlvaroM - Restaurante.docx
@@ -2097,30 +2097,14 @@
           <w:bCs/>
         </w:rPr>
         <w:lastRenderedPageBreak/>
-        <w:t xml:space="preserve">Sprint </w:t>
-      </w:r>
-      <w:proofErr w:type="gramStart"/>
+        <w:t>Sprint 1</w:t>
+      </w:r>
       <w:r>
         <w:rPr>
           <w:b/>
           <w:bCs/>
         </w:rPr>
-        <w:t>1</w:t>
-      </w:r>
-      <w:r>
-        <w:rPr>
-          <w:b/>
-          <w:bCs/>
-        </w:rPr>
-        <w:t xml:space="preserve">  -</w:t>
-      </w:r>
-      <w:proofErr w:type="gramEnd"/>
-      <w:r>
-        <w:rPr>
-          <w:b/>
-          <w:bCs/>
-        </w:rPr>
-        <w:t xml:space="preserve"> Fundamentos del Sistema y Roles</w:t>
+        <w:t xml:space="preserve">  - Fundamentos del Sistema y Roles</w:t>
       </w:r>
       <w:bookmarkEnd w:id="2"/>
     </w:p>
@@ -3007,37 +2991,21 @@
           <w:bCs/>
         </w:rPr>
         <w:lastRenderedPageBreak/>
-        <w:t xml:space="preserve">Sprint </w:t>
-      </w:r>
-      <w:proofErr w:type="gramStart"/>
+        <w:t>Sprint 2</w:t>
+      </w:r>
       <w:r>
         <w:rPr>
           <w:b/>
           <w:bCs/>
         </w:rPr>
-        <w:t>2</w:t>
+        <w:t xml:space="preserve"> </w:t>
       </w:r>
       <w:r>
         <w:rPr>
           <w:b/>
           <w:bCs/>
         </w:rPr>
-        <w:t xml:space="preserve"> </w:t>
-      </w:r>
-      <w:r>
-        <w:rPr>
-          <w:b/>
-          <w:bCs/>
-        </w:rPr>
-        <w:t xml:space="preserve"> -</w:t>
-      </w:r>
-      <w:proofErr w:type="gramEnd"/>
-      <w:r>
-        <w:rPr>
-          <w:b/>
-          <w:bCs/>
-        </w:rPr>
-        <w:t xml:space="preserve"> Gestión de Mesas y toma de pedidos.</w:t>
+        <w:t xml:space="preserve"> - Gestión de Mesas y toma de pedidos.</w:t>
       </w:r>
       <w:bookmarkEnd w:id="10"/>
     </w:p>
@@ -3654,7 +3622,7 @@
           <w:noProof/>
         </w:rPr>
         <w:drawing>
-          <wp:anchor distT="0" distB="0" distL="114300" distR="114300" simplePos="0" relativeHeight="251678720" behindDoc="0" locked="0" layoutInCell="1" allowOverlap="1" wp14:anchorId="61C4CDEA" wp14:editId="69AB3714">
+          <wp:anchor distT="0" distB="0" distL="114300" distR="114300" simplePos="0" relativeHeight="251678720" behindDoc="0" locked="0" layoutInCell="1" allowOverlap="1" wp14:anchorId="61C4CDEA" wp14:editId="47917D44">
             <wp:simplePos x="0" y="0"/>
             <wp:positionH relativeFrom="column">
               <wp:posOffset>3704590</wp:posOffset>
@@ -4568,6 +4536,417 @@
       </w:r>
     </w:p>
     <w:p>
+      <w:r>
+        <w:br w:type="page"/>
+      </w:r>
+    </w:p>
+    <w:p>
+      <w:pPr>
+        <w:pStyle w:val="Heading3"/>
+      </w:pPr>
+      <w:r>
+        <w:lastRenderedPageBreak/>
+        <w:t xml:space="preserve">Lógica </w:t>
+      </w:r>
+      <w:r>
+        <w:t>de la carta</w:t>
+      </w:r>
+    </w:p>
+    <w:p>
+      <w:pPr>
+        <w:jc w:val="both"/>
+      </w:pPr>
+      <w:r>
+        <w:drawing>
+          <wp:anchor distT="0" distB="0" distL="114300" distR="114300" simplePos="0" relativeHeight="251698176" behindDoc="0" locked="0" layoutInCell="1" allowOverlap="1" wp14:anchorId="2A7AD64F" wp14:editId="5768ECAB">
+            <wp:simplePos x="0" y="0"/>
+            <wp:positionH relativeFrom="margin">
+              <wp:posOffset>-1270</wp:posOffset>
+            </wp:positionH>
+            <wp:positionV relativeFrom="paragraph">
+              <wp:posOffset>495024</wp:posOffset>
+            </wp:positionV>
+            <wp:extent cx="5400040" cy="2476500"/>
+            <wp:effectExtent l="0" t="0" r="0" b="0"/>
+            <wp:wrapTopAndBottom/>
+            <wp:docPr id="1938062715" name="Picture 1"/>
+            <wp:cNvGraphicFramePr>
+              <a:graphicFrameLocks xmlns:a="http://schemas.openxmlformats.org/drawingml/2006/main" noChangeAspect="1"/>
+            </wp:cNvGraphicFramePr>
+            <a:graphic xmlns:a="http://schemas.openxmlformats.org/drawingml/2006/main">
+              <a:graphicData uri="http://schemas.openxmlformats.org/drawingml/2006/picture">
+                <pic:pic xmlns:pic="http://schemas.openxmlformats.org/drawingml/2006/picture">
+                  <pic:nvPicPr>
+                    <pic:cNvPr id="1938062715" name=""/>
+                    <pic:cNvPicPr/>
+                  </pic:nvPicPr>
+                  <pic:blipFill>
+                    <a:blip r:embed="rId31" cstate="print">
+                      <a:extLst>
+                        <a:ext uri="{28A0092B-C50C-407E-A947-70E740481C1C}">
+                          <a14:useLocalDpi xmlns:a14="http://schemas.microsoft.com/office/drawing/2010/main" val="0"/>
+                        </a:ext>
+                      </a:extLst>
+                    </a:blip>
+                    <a:stretch>
+                      <a:fillRect/>
+                    </a:stretch>
+                  </pic:blipFill>
+                  <pic:spPr>
+                    <a:xfrm>
+                      <a:off x="0" y="0"/>
+                      <a:ext cx="5400040" cy="2476500"/>
+                    </a:xfrm>
+                    <a:prstGeom prst="rect">
+                      <a:avLst/>
+                    </a:prstGeom>
+                  </pic:spPr>
+                </pic:pic>
+              </a:graphicData>
+            </a:graphic>
+          </wp:anchor>
+        </w:drawing>
+      </w:r>
+      <w:r>
+        <w:t xml:space="preserve">Para la lógica de la carta, nos aparece una lista con todos los productos en una </w:t>
+      </w:r>
+      <w:proofErr w:type="spellStart"/>
+      <w:r>
+        <w:t>card</w:t>
+      </w:r>
+      <w:proofErr w:type="spellEnd"/>
+      <w:r>
+        <w:t>, con la imagen, el nombre del producto, el precio, y un botón de Añadir.</w:t>
+      </w:r>
+    </w:p>
+    <w:p>
+      <w:pPr>
+        <w:jc w:val="both"/>
+      </w:pPr>
+      <w:r>
+        <w:drawing>
+          <wp:anchor distT="0" distB="0" distL="114300" distR="114300" simplePos="0" relativeHeight="251699200" behindDoc="0" locked="0" layoutInCell="1" allowOverlap="1" wp14:anchorId="7B608D69" wp14:editId="00754997">
+            <wp:simplePos x="0" y="0"/>
+            <wp:positionH relativeFrom="margin">
+              <wp:posOffset>-448202</wp:posOffset>
+            </wp:positionH>
+            <wp:positionV relativeFrom="paragraph">
+              <wp:posOffset>2898221</wp:posOffset>
+            </wp:positionV>
+            <wp:extent cx="3292236" cy="2798066"/>
+            <wp:effectExtent l="0" t="0" r="3810" b="2540"/>
+            <wp:wrapTopAndBottom/>
+            <wp:docPr id="1189334441" name="Picture 1"/>
+            <wp:cNvGraphicFramePr>
+              <a:graphicFrameLocks xmlns:a="http://schemas.openxmlformats.org/drawingml/2006/main" noChangeAspect="1"/>
+            </wp:cNvGraphicFramePr>
+            <a:graphic xmlns:a="http://schemas.openxmlformats.org/drawingml/2006/main">
+              <a:graphicData uri="http://schemas.openxmlformats.org/drawingml/2006/picture">
+                <pic:pic xmlns:pic="http://schemas.openxmlformats.org/drawingml/2006/picture">
+                  <pic:nvPicPr>
+                    <pic:cNvPr id="1189334441" name=""/>
+                    <pic:cNvPicPr/>
+                  </pic:nvPicPr>
+                  <pic:blipFill>
+                    <a:blip r:embed="rId32">
+                      <a:extLst>
+                        <a:ext uri="{28A0092B-C50C-407E-A947-70E740481C1C}">
+                          <a14:useLocalDpi xmlns:a14="http://schemas.microsoft.com/office/drawing/2010/main" val="0"/>
+                        </a:ext>
+                      </a:extLst>
+                    </a:blip>
+                    <a:stretch>
+                      <a:fillRect/>
+                    </a:stretch>
+                  </pic:blipFill>
+                  <pic:spPr>
+                    <a:xfrm>
+                      <a:off x="0" y="0"/>
+                      <a:ext cx="3292236" cy="2798066"/>
+                    </a:xfrm>
+                    <a:prstGeom prst="rect">
+                      <a:avLst/>
+                    </a:prstGeom>
+                  </pic:spPr>
+                </pic:pic>
+              </a:graphicData>
+            </a:graphic>
+          </wp:anchor>
+        </w:drawing>
+      </w:r>
+      <w:r>
+        <w:drawing>
+          <wp:anchor distT="0" distB="0" distL="114300" distR="114300" simplePos="0" relativeHeight="251702272" behindDoc="0" locked="0" layoutInCell="1" allowOverlap="1" wp14:anchorId="4FBD9EDB" wp14:editId="326B2271">
+            <wp:simplePos x="0" y="0"/>
+            <wp:positionH relativeFrom="column">
+              <wp:posOffset>2867025</wp:posOffset>
+            </wp:positionH>
+            <wp:positionV relativeFrom="paragraph">
+              <wp:posOffset>3722370</wp:posOffset>
+            </wp:positionV>
+            <wp:extent cx="3353435" cy="1047115"/>
+            <wp:effectExtent l="0" t="0" r="0" b="635"/>
+            <wp:wrapSquare wrapText="bothSides"/>
+            <wp:docPr id="685967549" name="Picture 1"/>
+            <wp:cNvGraphicFramePr>
+              <a:graphicFrameLocks xmlns:a="http://schemas.openxmlformats.org/drawingml/2006/main" noChangeAspect="1"/>
+            </wp:cNvGraphicFramePr>
+            <a:graphic xmlns:a="http://schemas.openxmlformats.org/drawingml/2006/main">
+              <a:graphicData uri="http://schemas.openxmlformats.org/drawingml/2006/picture">
+                <pic:pic xmlns:pic="http://schemas.openxmlformats.org/drawingml/2006/picture">
+                  <pic:nvPicPr>
+                    <pic:cNvPr id="685967549" name=""/>
+                    <pic:cNvPicPr/>
+                  </pic:nvPicPr>
+                  <pic:blipFill>
+                    <a:blip r:embed="rId33">
+                      <a:extLst>
+                        <a:ext uri="{28A0092B-C50C-407E-A947-70E740481C1C}">
+                          <a14:useLocalDpi xmlns:a14="http://schemas.microsoft.com/office/drawing/2010/main" val="0"/>
+                        </a:ext>
+                      </a:extLst>
+                    </a:blip>
+                    <a:stretch>
+                      <a:fillRect/>
+                    </a:stretch>
+                  </pic:blipFill>
+                  <pic:spPr>
+                    <a:xfrm>
+                      <a:off x="0" y="0"/>
+                      <a:ext cx="3353435" cy="1047115"/>
+                    </a:xfrm>
+                    <a:prstGeom prst="rect">
+                      <a:avLst/>
+                    </a:prstGeom>
+                  </pic:spPr>
+                </pic:pic>
+              </a:graphicData>
+            </a:graphic>
+            <wp14:sizeRelH relativeFrom="margin">
+              <wp14:pctWidth>0</wp14:pctWidth>
+            </wp14:sizeRelH>
+            <wp14:sizeRelV relativeFrom="margin">
+              <wp14:pctHeight>0</wp14:pctHeight>
+            </wp14:sizeRelV>
+          </wp:anchor>
+        </w:drawing>
+      </w:r>
+      <w:r>
+        <w:t xml:space="preserve">En esta </w:t>
+      </w:r>
+      <w:proofErr w:type="spellStart"/>
+      <w:r>
+        <w:t>card</w:t>
+      </w:r>
+      <w:proofErr w:type="spellEnd"/>
+      <w:r>
+        <w:t>, se ha añadido la funcionalidad de filtrar por categorías; cada vez que pones una categoría, se hace una selección de los pedidos de esa categoría.</w:t>
+      </w:r>
+      <w:r>
+        <w:rPr>
+          <w:noProof/>
+        </w:rPr>
+        <w:t xml:space="preserve"> </w:t>
+      </w:r>
+    </w:p>
+    <w:p>
+      <w:pPr>
+        <w:jc w:val="both"/>
+      </w:pPr>
+      <w:r>
+        <w:drawing>
+          <wp:anchor distT="0" distB="0" distL="114300" distR="114300" simplePos="0" relativeHeight="251700224" behindDoc="0" locked="0" layoutInCell="1" allowOverlap="1" wp14:anchorId="255D1E74" wp14:editId="58D2947D">
+            <wp:simplePos x="0" y="0"/>
+            <wp:positionH relativeFrom="margin">
+              <wp:align>center</wp:align>
+            </wp:positionH>
+            <wp:positionV relativeFrom="paragraph">
+              <wp:posOffset>3040643</wp:posOffset>
+            </wp:positionV>
+            <wp:extent cx="3434032" cy="1778780"/>
+            <wp:effectExtent l="0" t="0" r="0" b="0"/>
+            <wp:wrapTopAndBottom/>
+            <wp:docPr id="1483196033" name="Picture 1"/>
+            <wp:cNvGraphicFramePr>
+              <a:graphicFrameLocks xmlns:a="http://schemas.openxmlformats.org/drawingml/2006/main" noChangeAspect="1"/>
+            </wp:cNvGraphicFramePr>
+            <a:graphic xmlns:a="http://schemas.openxmlformats.org/drawingml/2006/main">
+              <a:graphicData uri="http://schemas.openxmlformats.org/drawingml/2006/picture">
+                <pic:pic xmlns:pic="http://schemas.openxmlformats.org/drawingml/2006/picture">
+                  <pic:nvPicPr>
+                    <pic:cNvPr id="1483196033" name=""/>
+                    <pic:cNvPicPr/>
+                  </pic:nvPicPr>
+                  <pic:blipFill>
+                    <a:blip r:embed="rId34">
+                      <a:extLst>
+                        <a:ext uri="{28A0092B-C50C-407E-A947-70E740481C1C}">
+                          <a14:useLocalDpi xmlns:a14="http://schemas.microsoft.com/office/drawing/2010/main" val="0"/>
+                        </a:ext>
+                      </a:extLst>
+                    </a:blip>
+                    <a:stretch>
+                      <a:fillRect/>
+                    </a:stretch>
+                  </pic:blipFill>
+                  <pic:spPr>
+                    <a:xfrm>
+                      <a:off x="0" y="0"/>
+                      <a:ext cx="3434032" cy="1778780"/>
+                    </a:xfrm>
+                    <a:prstGeom prst="rect">
+                      <a:avLst/>
+                    </a:prstGeom>
+                  </pic:spPr>
+                </pic:pic>
+              </a:graphicData>
+            </a:graphic>
+          </wp:anchor>
+        </w:drawing>
+      </w:r>
+      <w:r>
+        <w:t>Cuando pulsamos en añadir, añadimos el producto a la lista de pedido:</w:t>
+      </w:r>
+    </w:p>
+    <w:p>
+      <w:pPr>
+        <w:jc w:val="both"/>
+      </w:pPr>
+      <w:r>
+        <w:t>Añade el producto a la variable de sesión ‘carrito’, que a su vez es una array asociativa.</w:t>
+      </w:r>
+    </w:p>
+    <w:p>
+      <w:pPr>
+        <w:pStyle w:val="Heading3"/>
+      </w:pPr>
+      <w:r>
+        <w:lastRenderedPageBreak/>
+        <w:t>Lógica del carrito</w:t>
+      </w:r>
+    </w:p>
+    <w:p>
+      <w:r>
+        <w:drawing>
+          <wp:anchor distT="0" distB="0" distL="114300" distR="114300" simplePos="0" relativeHeight="251701248" behindDoc="0" locked="0" layoutInCell="1" allowOverlap="1" wp14:anchorId="3A5B296F" wp14:editId="700A8CDF">
+            <wp:simplePos x="0" y="0"/>
+            <wp:positionH relativeFrom="margin">
+              <wp:align>center</wp:align>
+            </wp:positionH>
+            <wp:positionV relativeFrom="paragraph">
+              <wp:posOffset>443398</wp:posOffset>
+            </wp:positionV>
+            <wp:extent cx="4223385" cy="3520440"/>
+            <wp:effectExtent l="0" t="0" r="5715" b="3810"/>
+            <wp:wrapTopAndBottom/>
+            <wp:docPr id="60504372" name="Picture 1"/>
+            <wp:cNvGraphicFramePr>
+              <a:graphicFrameLocks xmlns:a="http://schemas.openxmlformats.org/drawingml/2006/main" noChangeAspect="1"/>
+            </wp:cNvGraphicFramePr>
+            <a:graphic xmlns:a="http://schemas.openxmlformats.org/drawingml/2006/main">
+              <a:graphicData uri="http://schemas.openxmlformats.org/drawingml/2006/picture">
+                <pic:pic xmlns:pic="http://schemas.openxmlformats.org/drawingml/2006/picture">
+                  <pic:nvPicPr>
+                    <pic:cNvPr id="60504372" name=""/>
+                    <pic:cNvPicPr/>
+                  </pic:nvPicPr>
+                  <pic:blipFill>
+                    <a:blip r:embed="rId35">
+                      <a:extLst>
+                        <a:ext uri="{28A0092B-C50C-407E-A947-70E740481C1C}">
+                          <a14:useLocalDpi xmlns:a14="http://schemas.microsoft.com/office/drawing/2010/main" val="0"/>
+                        </a:ext>
+                      </a:extLst>
+                    </a:blip>
+                    <a:stretch>
+                      <a:fillRect/>
+                    </a:stretch>
+                  </pic:blipFill>
+                  <pic:spPr>
+                    <a:xfrm>
+                      <a:off x="0" y="0"/>
+                      <a:ext cx="4223385" cy="3520440"/>
+                    </a:xfrm>
+                    <a:prstGeom prst="rect">
+                      <a:avLst/>
+                    </a:prstGeom>
+                  </pic:spPr>
+                </pic:pic>
+              </a:graphicData>
+            </a:graphic>
+          </wp:anchor>
+        </w:drawing>
+      </w:r>
+      <w:r>
+        <w:t xml:space="preserve">Mostramos en una tabla la sesión del carrito con los productos añadidos y los campos necesarios para su correcta inserción en la base de datos. </w:t>
+      </w:r>
+    </w:p>
+    <w:p>
+      <w:r>
+        <w:rPr>
+          <w:noProof/>
+        </w:rPr>
+        <w:drawing>
+          <wp:anchor distT="0" distB="0" distL="114300" distR="114300" simplePos="0" relativeHeight="251703296" behindDoc="0" locked="0" layoutInCell="1" allowOverlap="1" wp14:anchorId="6F785F79" wp14:editId="1A47E4DF">
+            <wp:simplePos x="0" y="0"/>
+            <wp:positionH relativeFrom="margin">
+              <wp:align>center</wp:align>
+            </wp:positionH>
+            <wp:positionV relativeFrom="paragraph">
+              <wp:posOffset>3760626</wp:posOffset>
+            </wp:positionV>
+            <wp:extent cx="4140774" cy="1876592"/>
+            <wp:effectExtent l="0" t="0" r="0" b="0"/>
+            <wp:wrapTopAndBottom/>
+            <wp:docPr id="364591387" name="Picture 1"/>
+            <wp:cNvGraphicFramePr>
+              <a:graphicFrameLocks xmlns:a="http://schemas.openxmlformats.org/drawingml/2006/main" noChangeAspect="1"/>
+            </wp:cNvGraphicFramePr>
+            <a:graphic xmlns:a="http://schemas.openxmlformats.org/drawingml/2006/main">
+              <a:graphicData uri="http://schemas.openxmlformats.org/drawingml/2006/picture">
+                <pic:pic xmlns:pic="http://schemas.openxmlformats.org/drawingml/2006/picture">
+                  <pic:nvPicPr>
+                    <pic:cNvPr id="364591387" name=""/>
+                    <pic:cNvPicPr/>
+                  </pic:nvPicPr>
+                  <pic:blipFill>
+                    <a:blip r:embed="rId36">
+                      <a:extLst>
+                        <a:ext uri="{28A0092B-C50C-407E-A947-70E740481C1C}">
+                          <a14:useLocalDpi xmlns:a14="http://schemas.microsoft.com/office/drawing/2010/main" val="0"/>
+                        </a:ext>
+                      </a:extLst>
+                    </a:blip>
+                    <a:stretch>
+                      <a:fillRect/>
+                    </a:stretch>
+                  </pic:blipFill>
+                  <pic:spPr>
+                    <a:xfrm>
+                      <a:off x="0" y="0"/>
+                      <a:ext cx="4140774" cy="1876592"/>
+                    </a:xfrm>
+                    <a:prstGeom prst="rect">
+                      <a:avLst/>
+                    </a:prstGeom>
+                  </pic:spPr>
+                </pic:pic>
+              </a:graphicData>
+            </a:graphic>
+          </wp:anchor>
+        </w:drawing>
+      </w:r>
+      <w:r>
+        <w:t xml:space="preserve">He añadido 2 botones </w:t>
+      </w:r>
+    </w:p>
+    <w:p/>
+    <w:p>
+      <w:r>
+        <w:br w:type="page"/>
+      </w:r>
+    </w:p>
+    <w:p>
       <w:pPr>
         <w:jc w:val="both"/>
       </w:pPr>
@@ -4600,7 +4979,7 @@
                     <pic:cNvPicPr/>
                   </pic:nvPicPr>
                   <pic:blipFill>
-                    <a:blip r:embed="rId31">
+                    <a:blip r:embed="rId37">
                       <a:extLst>
                         <a:ext uri="{28A0092B-C50C-407E-A947-70E740481C1C}">
                           <a14:useLocalDpi xmlns:a14="http://schemas.microsoft.com/office/drawing/2010/main" val="0"/>
@@ -4655,23 +5034,7 @@
           <w:bCs/>
         </w:rPr>
         <w:lastRenderedPageBreak/>
-        <w:t xml:space="preserve">Sprint </w:t>
-      </w:r>
-      <w:proofErr w:type="gramStart"/>
-      <w:r>
-        <w:rPr>
-          <w:b/>
-          <w:bCs/>
-        </w:rPr>
-        <w:t>3  -</w:t>
-      </w:r>
-      <w:proofErr w:type="gramEnd"/>
-      <w:r>
-        <w:rPr>
-          <w:b/>
-          <w:bCs/>
-        </w:rPr>
-        <w:t xml:space="preserve"> Generación de cuentas y cierre de Mesas</w:t>
+        <w:t>Sprint 3  - Generación de cuentas y cierre de Mesas</w:t>
       </w:r>
       <w:bookmarkEnd w:id="17"/>
     </w:p>
@@ -4706,8 +5069,11 @@
         <w:jc w:val="both"/>
       </w:pPr>
       <w:r>
+        <w:rPr>
+          <w:noProof/>
+        </w:rPr>
         <w:drawing>
-          <wp:anchor distT="0" distB="0" distL="114300" distR="114300" simplePos="0" relativeHeight="251689984" behindDoc="0" locked="0" layoutInCell="1" allowOverlap="1" wp14:anchorId="7963232D" wp14:editId="5DFB78AF">
+          <wp:anchor distT="0" distB="0" distL="114300" distR="114300" simplePos="0" relativeHeight="251689984" behindDoc="0" locked="0" layoutInCell="1" allowOverlap="1" wp14:anchorId="7963232D" wp14:editId="64485FD6">
             <wp:simplePos x="0" y="0"/>
             <wp:positionH relativeFrom="margin">
               <wp:posOffset>-1270</wp:posOffset>
@@ -4730,7 +5096,7 @@
                     <pic:cNvPicPr/>
                   </pic:nvPicPr>
                   <pic:blipFill>
-                    <a:blip r:embed="rId32" cstate="print">
+                    <a:blip r:embed="rId38" cstate="print">
                       <a:extLst>
                         <a:ext uri="{28A0092B-C50C-407E-A947-70E740481C1C}">
                           <a14:useLocalDpi xmlns:a14="http://schemas.microsoft.com/office/drawing/2010/main" val="0"/>
@@ -4779,6 +5145,9 @@
         <w:jc w:val="both"/>
       </w:pPr>
       <w:r>
+        <w:rPr>
+          <w:noProof/>
+        </w:rPr>
         <w:drawing>
           <wp:anchor distT="0" distB="0" distL="114300" distR="114300" simplePos="0" relativeHeight="251692032" behindDoc="0" locked="0" layoutInCell="1" allowOverlap="1" wp14:anchorId="55AA820B" wp14:editId="0CE6CB86">
             <wp:simplePos x="0" y="0"/>
@@ -4803,7 +5172,7 @@
                     <pic:cNvPicPr/>
                   </pic:nvPicPr>
                   <pic:blipFill>
-                    <a:blip r:embed="rId33">
+                    <a:blip r:embed="rId39">
                       <a:extLst>
                         <a:ext uri="{28A0092B-C50C-407E-A947-70E740481C1C}">
                           <a14:useLocalDpi xmlns:a14="http://schemas.microsoft.com/office/drawing/2010/main" val="0"/>
@@ -4836,6 +5205,9 @@
         </w:drawing>
       </w:r>
       <w:r>
+        <w:rPr>
+          <w:noProof/>
+        </w:rPr>
         <w:drawing>
           <wp:anchor distT="0" distB="0" distL="114300" distR="114300" simplePos="0" relativeHeight="251691008" behindDoc="0" locked="0" layoutInCell="1" allowOverlap="1" wp14:anchorId="79EC0334" wp14:editId="60E3B279">
             <wp:simplePos x="0" y="0"/>
@@ -4860,7 +5232,7 @@
                     <pic:cNvPicPr/>
                   </pic:nvPicPr>
                   <pic:blipFill>
-                    <a:blip r:embed="rId34">
+                    <a:blip r:embed="rId40">
                       <a:extLst>
                         <a:ext uri="{28A0092B-C50C-407E-A947-70E740481C1C}">
                           <a14:useLocalDpi xmlns:a14="http://schemas.microsoft.com/office/drawing/2010/main" val="0"/>
@@ -4925,6 +5297,9 @@
     </w:p>
     <w:p>
       <w:r>
+        <w:rPr>
+          <w:noProof/>
+        </w:rPr>
         <w:lastRenderedPageBreak/>
         <w:drawing>
           <wp:anchor distT="0" distB="0" distL="114300" distR="114300" simplePos="0" relativeHeight="251693056" behindDoc="0" locked="0" layoutInCell="1" allowOverlap="1" wp14:anchorId="62A0F93B" wp14:editId="1760742B">
@@ -4950,7 +5325,7 @@
                     <pic:cNvPicPr/>
                   </pic:nvPicPr>
                   <pic:blipFill>
-                    <a:blip r:embed="rId35">
+                    <a:blip r:embed="rId41">
                       <a:extLst>
                         <a:ext uri="{28A0092B-C50C-407E-A947-70E740481C1C}">
                           <a14:useLocalDpi xmlns:a14="http://schemas.microsoft.com/office/drawing/2010/main" val="0"/>
@@ -4982,6 +5357,9 @@
     </w:p>
     <w:p>
       <w:r>
+        <w:rPr>
+          <w:noProof/>
+        </w:rPr>
         <w:drawing>
           <wp:anchor distT="0" distB="0" distL="114300" distR="114300" simplePos="0" relativeHeight="251694080" behindDoc="0" locked="0" layoutInCell="1" allowOverlap="1" wp14:anchorId="059276E3" wp14:editId="172B2060">
             <wp:simplePos x="0" y="0"/>
@@ -5006,7 +5384,7 @@
                     <pic:cNvPicPr/>
                   </pic:nvPicPr>
                   <pic:blipFill>
-                    <a:blip r:embed="rId36">
+                    <a:blip r:embed="rId42">
                       <a:extLst>
                         <a:ext uri="{28A0092B-C50C-407E-A947-70E740481C1C}">
                           <a14:useLocalDpi xmlns:a14="http://schemas.microsoft.com/office/drawing/2010/main" val="0"/>
@@ -5075,7 +5453,7 @@
                     </pic:cNvPicPr>
                   </pic:nvPicPr>
                   <pic:blipFill>
-                    <a:blip r:embed="rId37" cstate="print">
+                    <a:blip r:embed="rId43" cstate="print">
                       <a:extLst>
                         <a:ext uri="{28A0092B-C50C-407E-A947-70E740481C1C}">
                           <a14:useLocalDpi xmlns:a14="http://schemas.microsoft.com/office/drawing/2010/main" val="0"/>
@@ -5145,6 +5523,9 @@
     </w:p>
     <w:p>
       <w:r>
+        <w:rPr>
+          <w:noProof/>
+        </w:rPr>
         <w:drawing>
           <wp:inline distT="0" distB="0" distL="0" distR="0" wp14:anchorId="25ADFA18" wp14:editId="0735B391">
             <wp:extent cx="5400040" cy="1131570"/>
@@ -5161,7 +5542,7 @@
                     <pic:cNvPicPr/>
                   </pic:nvPicPr>
                   <pic:blipFill>
-                    <a:blip r:embed="rId38"/>
+                    <a:blip r:embed="rId44"/>
                     <a:stretch>
                       <a:fillRect/>
                     </a:stretch>
@@ -5184,6 +5565,9 @@
     </w:p>
     <w:p>
       <w:r>
+        <w:rPr>
+          <w:noProof/>
+        </w:rPr>
         <w:drawing>
           <wp:anchor distT="0" distB="0" distL="114300" distR="114300" simplePos="0" relativeHeight="251696128" behindDoc="0" locked="0" layoutInCell="1" allowOverlap="1" wp14:anchorId="0F9B5C17" wp14:editId="15268FD0">
             <wp:simplePos x="0" y="0"/>
@@ -5208,7 +5592,7 @@
                     <pic:cNvPicPr/>
                   </pic:nvPicPr>
                   <pic:blipFill>
-                    <a:blip r:embed="rId39">
+                    <a:blip r:embed="rId45">
                       <a:extLst>
                         <a:ext uri="{28A0092B-C50C-407E-A947-70E740481C1C}">
                           <a14:useLocalDpi xmlns:a14="http://schemas.microsoft.com/office/drawing/2010/main" val="0"/>
@@ -5240,6 +5624,9 @@
     </w:p>
     <w:p>
       <w:r>
+        <w:rPr>
+          <w:noProof/>
+        </w:rPr>
         <w:drawing>
           <wp:anchor distT="0" distB="0" distL="114300" distR="114300" simplePos="0" relativeHeight="251697152" behindDoc="0" locked="0" layoutInCell="1" allowOverlap="1" wp14:anchorId="503E880C" wp14:editId="2BED22FA">
             <wp:simplePos x="0" y="0"/>
@@ -5264,7 +5651,7 @@
                     <pic:cNvPicPr/>
                   </pic:nvPicPr>
                   <pic:blipFill>
-                    <a:blip r:embed="rId40">
+                    <a:blip r:embed="rId46">
                       <a:extLst>
                         <a:ext uri="{28A0092B-C50C-407E-A947-70E740481C1C}">
                           <a14:useLocalDpi xmlns:a14="http://schemas.microsoft.com/office/drawing/2010/main" val="0"/>
@@ -5343,7 +5730,7 @@
                     <pic:cNvPicPr/>
                   </pic:nvPicPr>
                   <pic:blipFill>
-                    <a:blip r:embed="rId41">
+                    <a:blip r:embed="rId47">
                       <a:extLst>
                         <a:ext uri="{28A0092B-C50C-407E-A947-70E740481C1C}">
                           <a14:useLocalDpi xmlns:a14="http://schemas.microsoft.com/office/drawing/2010/main" val="0"/>
@@ -5398,7 +5785,6 @@
         <w:t xml:space="preserve">de </w:t>
       </w:r>
       <w:proofErr w:type="spellStart"/>
-      <w:proofErr w:type="gramStart"/>
       <w:r>
         <w:rPr>
           <w:i/>
@@ -5415,11 +5801,7 @@
         <w:t xml:space="preserve"> </w:t>
       </w:r>
       <w:r>
-        <w:t xml:space="preserve"> poniendo</w:t>
-      </w:r>
-      <w:proofErr w:type="gramEnd"/>
-      <w:r>
-        <w:t xml:space="preserve"> el comando: </w:t>
+        <w:t xml:space="preserve"> poniendo el comando: </w:t>
       </w:r>
       <w:proofErr w:type="spellStart"/>
       <w:r>
@@ -5484,21 +5866,7 @@
         <w:jc w:val="both"/>
       </w:pPr>
       <w:r>
-        <w:t xml:space="preserve">Después de instalarlo; hacemos que el cliente </w:t>
-      </w:r>
-      <w:r>
-        <w:t>—</w:t>
-      </w:r>
-      <w:r>
-        <w:t xml:space="preserve">una vez pagado— tenga </w:t>
-      </w:r>
-      <w:proofErr w:type="gramStart"/>
-      <w:r>
-        <w:t>un  botón</w:t>
-      </w:r>
-      <w:proofErr w:type="gramEnd"/>
-      <w:r>
-        <w:t xml:space="preserve"> de ver factura: </w:t>
+        <w:t xml:space="preserve">Después de instalarlo; hacemos que el cliente —una vez pagado— tenga un  botón de ver factura: </w:t>
       </w:r>
     </w:p>
     <w:p>
@@ -5542,7 +5910,7 @@
                     <pic:cNvPicPr/>
                   </pic:nvPicPr>
                   <pic:blipFill>
-                    <a:blip r:embed="rId42">
+                    <a:blip r:embed="rId48">
                       <a:extLst>
                         <a:ext uri="{28A0092B-C50C-407E-A947-70E740481C1C}">
                           <a14:useLocalDpi xmlns:a14="http://schemas.microsoft.com/office/drawing/2010/main" val="0"/>
@@ -5589,6 +5957,9 @@
         <w:jc w:val="both"/>
       </w:pPr>
       <w:r>
+        <w:rPr>
+          <w:noProof/>
+        </w:rPr>
         <w:drawing>
           <wp:anchor distT="0" distB="0" distL="114300" distR="114300" simplePos="0" relativeHeight="251688960" behindDoc="0" locked="0" layoutInCell="1" allowOverlap="1" wp14:anchorId="2015B79B" wp14:editId="41C46306">
             <wp:simplePos x="0" y="0"/>
@@ -5613,7 +5984,7 @@
                     <pic:cNvPicPr/>
                   </pic:nvPicPr>
                   <pic:blipFill>
-                    <a:blip r:embed="rId43">
+                    <a:blip r:embed="rId49">
                       <a:extLst>
                         <a:ext uri="{28A0092B-C50C-407E-A947-70E740481C1C}">
                           <a14:useLocalDpi xmlns:a14="http://schemas.microsoft.com/office/drawing/2010/main" val="0"/>
@@ -5641,8 +6012,8 @@
       </w:r>
     </w:p>
     <w:sectPr>
-      <w:headerReference w:type="default" r:id="rId44"/>
-      <w:footerReference w:type="default" r:id="rId45"/>
+      <w:headerReference w:type="default" r:id="rId50"/>
+      <w:footerReference w:type="default" r:id="rId51"/>
       <w:pgSz w:w="11906" w:h="16838"/>
       <w:pgMar w:top="1417" w:right="1701" w:bottom="1417" w:left="1701" w:header="708" w:footer="643" w:gutter="0"/>
       <w:pgNumType w:start="0"/>

</xml_diff>